<commit_message>
Update the user guide with more screenshots
Co-Authored-By: Claude Opus 5 <noreply@anthropic.com>
</commit_message>
<xml_diff>
--- a/docs/docx/LEAP Review Tools - user guide.docx
+++ b/docs/docx/LEAP Review Tools - user guide.docx
@@ -76,7 +76,15 @@
         <w:t>dashboard</w:t>
       </w:r>
       <w:r>
-        <w:t xml:space="preserve"> produces a set of interactive web pages comparing LEAP against ESTO and the 9th Outlook across every sector and fuel. It is the tool to reach for when you want to see the whole picture, or show it to someone else.</w:t>
+        <w:t xml:space="preserve"> produces a set of interactive web pages comparing LEAP against ESTO and the 9th Outlook across every sector and fuel. It is the tool to reach for when you want to see the whole </w:t>
+      </w:r>
+      <w:proofErr w:type="gramStart"/>
+      <w:r>
+        <w:t>picture, or</w:t>
+      </w:r>
+      <w:proofErr w:type="gramEnd"/>
+      <w:r>
+        <w:t xml:space="preserve"> show it to someone else.</w:t>
       </w:r>
     </w:p>
     <w:p>
@@ -184,7 +192,21 @@
         <w:t>Windows will warn you the first time.</w:t>
       </w:r>
       <w:r>
-        <w:t xml:space="preserve"> You will see a blue box saying “Windows protected your PC”. This is expected: the program has not been registered with Microsoft. Click </w:t>
+        <w:t xml:space="preserve"> You </w:t>
+      </w:r>
+      <w:r>
+        <w:t>may</w:t>
+      </w:r>
+      <w:r>
+        <w:t xml:space="preserve"> see a blue box </w:t>
+      </w:r>
+      <w:proofErr w:type="gramStart"/>
+      <w:r>
+        <w:t>saying</w:t>
+      </w:r>
+      <w:proofErr w:type="gramEnd"/>
+      <w:r>
+        <w:t xml:space="preserve"> “Windows protected your PC”. This is expected: the program has not been registered with Microsoft. Click </w:t>
       </w:r>
       <w:r>
         <w:rPr>
@@ -196,26 +218,107 @@
       <w:r>
         <w:t xml:space="preserve">, then </w:t>
       </w:r>
+      <w:proofErr w:type="gramStart"/>
       <w:r>
         <w:rPr>
           <w:b/>
           <w:bCs/>
         </w:rPr>
-        <w:t>Run anyway</w:t>
-      </w:r>
-      <w:r>
-        <w:t>. You only need to do this once.</w:t>
-      </w:r>
-    </w:p>
-    <w:p>
-      <w:pPr>
-        <w:pStyle w:val="BodyText"/>
-      </w:pPr>
+        <w:t>Run</w:t>
+      </w:r>
+      <w:proofErr w:type="gramEnd"/>
       <w:r>
         <w:rPr>
           <w:b/>
           <w:bCs/>
         </w:rPr>
+        <w:t xml:space="preserve"> anyway</w:t>
+      </w:r>
+      <w:r>
+        <w:t>. You only need to do this once.</w:t>
+      </w:r>
+    </w:p>
+    <w:p>
+      <w:pPr>
+        <w:pStyle w:val="BodyText"/>
+        <w:rPr>
+          <w:lang w:val="en-NZ"/>
+        </w:rPr>
+      </w:pPr>
+      <w:r>
+        <w:lastRenderedPageBreak/>
+        <w:t>The APERC security software will also try to stop you. Just say ‘Allow once’ like in the image below:</w:t>
+      </w:r>
+      <w:r>
+        <w:rPr>
+          <w:rFonts w:ascii="Times New Roman" w:eastAsia="Times New Roman" w:hAnsi="Times New Roman" w:cs="Times New Roman"/>
+          <w:lang w:val="en-NZ" w:eastAsia="ja-JP"/>
+        </w:rPr>
+        <w:t xml:space="preserve"> </w:t>
+      </w:r>
+      <w:r>
+        <w:rPr>
+          <w:lang w:val="en-NZ"/>
+        </w:rPr>
+        <w:drawing>
+          <wp:inline distT="0" distB="0" distL="0" distR="0" wp14:anchorId="6CFE9370" wp14:editId="12C9114F">
+            <wp:extent cx="5943600" cy="4003675"/>
+            <wp:effectExtent l="0" t="0" r="0" b="0"/>
+            <wp:docPr id="326637283" name="Picture 2"/>
+            <wp:cNvGraphicFramePr>
+              <a:graphicFrameLocks xmlns:a="http://schemas.openxmlformats.org/drawingml/2006/main" noChangeAspect="1"/>
+            </wp:cNvGraphicFramePr>
+            <a:graphic xmlns:a="http://schemas.openxmlformats.org/drawingml/2006/main">
+              <a:graphicData uri="http://schemas.openxmlformats.org/drawingml/2006/picture">
+                <pic:pic xmlns:pic="http://schemas.openxmlformats.org/drawingml/2006/picture">
+                  <pic:nvPicPr>
+                    <pic:cNvPr id="0" name="Picture 6"/>
+                    <pic:cNvPicPr>
+                      <a:picLocks noChangeAspect="1" noChangeArrowheads="1"/>
+                    </pic:cNvPicPr>
+                  </pic:nvPicPr>
+                  <pic:blipFill>
+                    <a:blip r:embed="rId6" cstate="print">
+                      <a:extLst>
+                        <a:ext uri="{28A0092B-C50C-407E-A947-70E740481C1C}">
+                          <a14:useLocalDpi xmlns:a14="http://schemas.microsoft.com/office/drawing/2010/main" val="0"/>
+                        </a:ext>
+                      </a:extLst>
+                    </a:blip>
+                    <a:srcRect/>
+                    <a:stretch>
+                      <a:fillRect/>
+                    </a:stretch>
+                  </pic:blipFill>
+                  <pic:spPr bwMode="auto">
+                    <a:xfrm>
+                      <a:off x="0" y="0"/>
+                      <a:ext cx="5943600" cy="4003675"/>
+                    </a:xfrm>
+                    <a:prstGeom prst="rect">
+                      <a:avLst/>
+                    </a:prstGeom>
+                    <a:noFill/>
+                    <a:ln>
+                      <a:noFill/>
+                    </a:ln>
+                  </pic:spPr>
+                </pic:pic>
+              </a:graphicData>
+            </a:graphic>
+          </wp:inline>
+        </w:drawing>
+      </w:r>
+    </w:p>
+    <w:p>
+      <w:pPr>
+        <w:pStyle w:val="BodyText"/>
+      </w:pPr>
+      <w:r>
+        <w:rPr>
+          <w:b/>
+          <w:bCs/>
+        </w:rPr>
         <w:t>You do not need Excel to run the tools.</w:t>
       </w:r>
       <w:r>
@@ -251,7 +354,6 @@
         <w:rPr>
           <w:lang w:val="en-NZ"/>
         </w:rPr>
-        <w:lastRenderedPageBreak/>
         <w:t>Exporting results</w:t>
       </w:r>
       <w:r>
@@ -291,6 +393,7 @@
           <w:noProof/>
           <w:lang w:val="en-NZ"/>
         </w:rPr>
+        <w:lastRenderedPageBreak/>
         <w:drawing>
           <wp:inline distT="0" distB="0" distL="0" distR="0" wp14:anchorId="05707D3E" wp14:editId="47816FEA">
             <wp:extent cx="5943600" cy="1687195"/>
@@ -313,7 +416,7 @@
                     <pic:cNvPicPr/>
                   </pic:nvPicPr>
                   <pic:blipFill>
-                    <a:blip r:embed="rId6"/>
+                    <a:blip r:embed="rId7"/>
                     <a:stretch>
                       <a:fillRect/>
                     </a:stretch>
@@ -363,7 +466,7 @@
           <w:lang w:val="en-NZ"/>
         </w:rPr>
         <w:drawing>
-          <wp:inline distT="0" distB="0" distL="0" distR="0" wp14:anchorId="4BAF4D48" wp14:editId="1DF90359">
+          <wp:inline distT="0" distB="0" distL="0" distR="0" wp14:anchorId="4BAF4D48" wp14:editId="61E7C04C">
             <wp:extent cx="1802432" cy="2537735"/>
             <wp:effectExtent l="0" t="0" r="0" b="0"/>
             <wp:docPr id="38653467" name="Picture 1" descr="The image appears to be a table or data entry showing various types of fuels, including Nuclear Heat, Biogas, Naphtha, and Bitumen, with corresponding values for different attributes like price, volume, and additional statistics.&#10;&#10;AI-generated content may be incorrect.">
@@ -384,7 +487,7 @@
                     <pic:cNvPicPr/>
                   </pic:nvPicPr>
                   <pic:blipFill rotWithShape="1">
-                    <a:blip r:embed="rId7" cstate="print">
+                    <a:blip r:embed="rId8" cstate="print">
                       <a:extLst>
                         <a:ext uri="{28A0092B-C50C-407E-A947-70E740481C1C}">
                           <a14:useLocalDpi xmlns:a14="http://schemas.microsoft.com/office/drawing/2010/main" val="0"/>
@@ -465,7 +568,6 @@
         <w:rPr>
           <w:noProof/>
         </w:rPr>
-        <w:lastRenderedPageBreak/>
         <w:drawing>
           <wp:inline distT="0" distB="0" distL="0" distR="0" wp14:anchorId="4F08C005" wp14:editId="1DBB4F3E">
             <wp:extent cx="5334000" cy="1197428"/>
@@ -482,7 +584,7 @@
                     </pic:cNvPicPr>
                   </pic:nvPicPr>
                   <pic:blipFill>
-                    <a:blip r:embed="rId8"/>
+                    <a:blip r:embed="rId9"/>
                     <a:stretch>
                       <a:fillRect/>
                     </a:stretch>
@@ -514,6 +616,7 @@
         <w:pStyle w:val="BodyText"/>
       </w:pPr>
       <w:r>
+        <w:lastRenderedPageBreak/>
         <w:t>This is the same layout the modelling team uses, so you can copy a folder straight across in either direction.</w:t>
       </w:r>
     </w:p>
@@ -627,8 +730,13 @@
       <w:pPr>
         <w:pStyle w:val="FirstParagraph"/>
       </w:pPr>
-      <w:r>
-        <w:t>Anything else in the name is up to you, and the order does not matter. All of these are fine:</w:t>
+      <w:proofErr w:type="gramStart"/>
+      <w:r>
+        <w:t>Anything</w:t>
+      </w:r>
+      <w:proofErr w:type="gramEnd"/>
+      <w:r>
+        <w:t xml:space="preserve"> else in the name is up to you, and the order does not matter. All of these are fine:</w:t>
       </w:r>
     </w:p>
     <w:p>
@@ -707,7 +815,15 @@
         <w:t>If you have several files for one economy and scenario, the newest date wins.</w:t>
       </w:r>
       <w:r>
-        <w:t xml:space="preserve"> That is what the date is for. You do not have to delete the older ones — leave them and the tools will use the most recent. If you would rather they were out of the way, make a folder called </w:t>
+        <w:t xml:space="preserve"> That is what the date is for. You do not have to delete the older ones — leave them and the tools will use the most recent. If you would </w:t>
+      </w:r>
+      <w:proofErr w:type="gramStart"/>
+      <w:r>
+        <w:t>rather</w:t>
+      </w:r>
+      <w:proofErr w:type="gramEnd"/>
+      <w:r>
+        <w:t xml:space="preserve"> they were out of the way, make a folder called </w:t>
       </w:r>
       <w:r>
         <w:rPr>
@@ -742,7 +858,15 @@
         <w:t>list</w:t>
       </w:r>
       <w:r>
-        <w:t xml:space="preserve"> to see what has actually been picked up.</w:t>
+        <w:t xml:space="preserve"> to see what has </w:t>
+      </w:r>
+      <w:proofErr w:type="gramStart"/>
+      <w:r>
+        <w:t>actually been</w:t>
+      </w:r>
+      <w:proofErr w:type="gramEnd"/>
+      <w:r>
+        <w:t xml:space="preserve"> picked up.</w:t>
       </w:r>
       <w:bookmarkStart w:id="4" w:name="one-thing-that-matters"/>
       <w:bookmarkEnd w:id="3"/>
@@ -817,60 +941,152 @@
         <w:rPr>
           <w:rStyle w:val="VerbatimChar"/>
         </w:rPr>
+        <w:t xml:space="preserve">      </w:t>
+      </w:r>
+      <w:proofErr w:type="gramStart"/>
+      <w:r>
+        <w:rPr>
+          <w:rStyle w:val="VerbatimChar"/>
+        </w:rPr>
+        <w:t>Reference  full</w:t>
+      </w:r>
+      <w:proofErr w:type="gramEnd"/>
+      <w:r>
+        <w:rPr>
+          <w:rStyle w:val="VerbatimChar"/>
+        </w:rPr>
+        <w:t xml:space="preserve"> model output all years 04082026 </w:t>
+      </w:r>
+      <w:proofErr w:type="gramStart"/>
+      <w:r>
+        <w:rPr>
+          <w:rStyle w:val="VerbatimChar"/>
+        </w:rPr>
+        <w:t>REF.xlsx  [</w:t>
+      </w:r>
+      <w:proofErr w:type="gramEnd"/>
+      <w:r>
+        <w:rPr>
+          <w:rStyle w:val="VerbatimChar"/>
+        </w:rPr>
+        <w:t>2022-2060]</w:t>
+      </w:r>
+      <w:r>
+        <w:br/>
+      </w:r>
+      <w:r>
+        <w:rPr>
+          <w:rStyle w:val="VerbatimChar"/>
+        </w:rPr>
+        <w:t xml:space="preserve">      Target     full model output all years 04082026 </w:t>
+      </w:r>
+      <w:proofErr w:type="gramStart"/>
+      <w:r>
+        <w:rPr>
+          <w:rStyle w:val="VerbatimChar"/>
+        </w:rPr>
+        <w:t>TGT.xlsx  [</w:t>
+      </w:r>
+      <w:proofErr w:type="gramEnd"/>
+      <w:r>
+        <w:rPr>
+          <w:rStyle w:val="VerbatimChar"/>
+        </w:rPr>
+        <w:t>2022-2060]</w:t>
+      </w:r>
+      <w:r>
+        <w:br/>
+      </w:r>
+      <w:r>
+        <w:rPr>
+          <w:rStyle w:val="VerbatimChar"/>
+        </w:rPr>
+        <w:t xml:space="preserve">  20_USA</w:t>
+      </w:r>
+      <w:r>
+        <w:br/>
+      </w:r>
+      <w:r>
+        <w:rPr>
+          <w:rStyle w:val="VerbatimChar"/>
+        </w:rPr>
+        <w:t xml:space="preserve">      </w:t>
+      </w:r>
+      <w:proofErr w:type="gramStart"/>
+      <w:r>
+        <w:rPr>
+          <w:rStyle w:val="VerbatimChar"/>
+        </w:rPr>
+        <w:t>Reference  full</w:t>
+      </w:r>
+      <w:proofErr w:type="gramEnd"/>
+      <w:r>
+        <w:rPr>
+          <w:rStyle w:val="VerbatimChar"/>
+        </w:rPr>
+        <w:t xml:space="preserve"> model output all years 03082026 </w:t>
+      </w:r>
+      <w:proofErr w:type="gramStart"/>
+      <w:r>
+        <w:rPr>
+          <w:rStyle w:val="VerbatimChar"/>
+        </w:rPr>
+        <w:t>REF.xlsx  [</w:t>
+      </w:r>
+      <w:proofErr w:type="gramEnd"/>
+      <w:r>
+        <w:rPr>
+          <w:rStyle w:val="VerbatimChar"/>
+        </w:rPr>
+        <w:t>2022-2060]</w:t>
+      </w:r>
+      <w:r>
+        <w:br/>
+      </w:r>
+      <w:r>
+        <w:rPr>
+          <w:rStyle w:val="VerbatimChar"/>
+        </w:rPr>
+        <w:t xml:space="preserve">      Target     full model output all years 03082026 </w:t>
+      </w:r>
+      <w:proofErr w:type="gramStart"/>
+      <w:r>
+        <w:rPr>
+          <w:rStyle w:val="VerbatimChar"/>
+        </w:rPr>
+        <w:t>TGT.xlsx  [</w:t>
+      </w:r>
+      <w:proofErr w:type="gramEnd"/>
+      <w:r>
+        <w:rPr>
+          <w:rStyle w:val="VerbatimChar"/>
+        </w:rPr>
+        <w:t>2022-2060]</w:t>
+      </w:r>
+    </w:p>
+    <w:p>
+      <w:pPr>
+        <w:pStyle w:val="FirstParagraph"/>
+      </w:pPr>
+      <w:r>
+        <w:t>Each economy is listed with the file chosen for each scenario and the years that file covers. This is the quickest way to confirm your files are named correctly and in the right place.</w:t>
+      </w:r>
+    </w:p>
+    <w:p>
+      <w:pPr>
+        <w:pStyle w:val="BodyText"/>
+      </w:pPr>
+      <w:r>
         <w:lastRenderedPageBreak/>
-        <w:t xml:space="preserve">      Reference  full model output all years 04082026 REF.xlsx  [2022-2060]</w:t>
-      </w:r>
-      <w:r>
-        <w:br/>
-      </w:r>
-      <w:r>
-        <w:rPr>
-          <w:rStyle w:val="VerbatimChar"/>
-        </w:rPr>
-        <w:t xml:space="preserve">      Target     full model output all years 04082026 TGT.xlsx  [2022-2060]</w:t>
-      </w:r>
-      <w:r>
-        <w:br/>
-      </w:r>
-      <w:r>
-        <w:rPr>
-          <w:rStyle w:val="VerbatimChar"/>
-        </w:rPr>
-        <w:t xml:space="preserve">  20_USA</w:t>
-      </w:r>
-      <w:r>
-        <w:br/>
-      </w:r>
-      <w:r>
-        <w:rPr>
-          <w:rStyle w:val="VerbatimChar"/>
-        </w:rPr>
-        <w:t xml:space="preserve">      Reference  full model output all years 03082026 REF.xlsx  [2022-2060]</w:t>
-      </w:r>
-      <w:r>
-        <w:br/>
-      </w:r>
-      <w:r>
-        <w:rPr>
-          <w:rStyle w:val="VerbatimChar"/>
-        </w:rPr>
-        <w:t xml:space="preserve">      Target     full model output all years 03082026 TGT.xlsx  [2022-2060]</w:t>
-      </w:r>
-    </w:p>
-    <w:p>
-      <w:pPr>
-        <w:pStyle w:val="FirstParagraph"/>
-      </w:pPr>
-      <w:r>
-        <w:t>Each economy is listed with the file chosen for each scenario and the years that file covers. This is the quickest way to confirm your files are named correctly and in the right place.</w:t>
-      </w:r>
-    </w:p>
-    <w:p>
-      <w:pPr>
-        <w:pStyle w:val="BodyText"/>
-      </w:pPr>
-      <w:r>
-        <w:t>If a file is named in a way the tools do not recognise, it says so here rather than quietly ignoring it. That is usually a typo in the date or the scenario.</w:t>
+        <w:t xml:space="preserve">If a file is named in a way the tools do not </w:t>
+      </w:r>
+      <w:proofErr w:type="spellStart"/>
+      <w:r>
+        <w:t>recognise</w:t>
+      </w:r>
+      <w:proofErr w:type="spellEnd"/>
+      <w:r>
+        <w:t>, it says so here rather than quietly ignoring it. That is usually a typo in the date or the scenario.</w:t>
       </w:r>
     </w:p>
     <w:p>
@@ -978,7 +1194,21 @@
         <w:rPr>
           <w:rStyle w:val="VerbatimChar"/>
         </w:rPr>
-        <w:t>output\20_USA\balance_review\balance_review_20_USA_tgt_2022.xlsx</w:t>
+        <w:t>output\20_USA\</w:t>
+      </w:r>
+      <w:proofErr w:type="spellStart"/>
+      <w:r>
+        <w:rPr>
+          <w:rStyle w:val="VerbatimChar"/>
+        </w:rPr>
+        <w:t>balance_review</w:t>
+      </w:r>
+      <w:proofErr w:type="spellEnd"/>
+      <w:r>
+        <w:rPr>
+          <w:rStyle w:val="VerbatimChar"/>
+        </w:rPr>
+        <w:t>\balance_review_20_USA_tgt_2022.xlsx</w:t>
       </w:r>
     </w:p>
     <w:p>
@@ -994,7 +1224,15 @@
         <w:pStyle w:val="BodyText"/>
       </w:pPr>
       <w:r>
-        <w:t xml:space="preserve">If you already have a diagnostics folder from the modelling team, you can use it directly instead — that is the </w:t>
+        <w:t xml:space="preserve">If you already have a diagnostics folder from the modelling team, you can use it directly </w:t>
+      </w:r>
+      <w:proofErr w:type="gramStart"/>
+      <w:r>
+        <w:t>instead — that is</w:t>
+      </w:r>
+      <w:proofErr w:type="gramEnd"/>
+      <w:r>
+        <w:t xml:space="preserve"> the </w:t>
       </w:r>
       <w:r>
         <w:rPr>
@@ -1031,6 +1269,9 @@
         <w:pStyle w:val="BodyText"/>
       </w:pPr>
       <w:r>
+        <w:rPr>
+          <w:noProof/>
+        </w:rPr>
         <w:drawing>
           <wp:inline distT="0" distB="0" distL="0" distR="0" wp14:anchorId="2C9FFF09" wp14:editId="72B9FDA0">
             <wp:extent cx="5943600" cy="3206750"/>
@@ -1047,7 +1288,7 @@
                     <pic:cNvPicPr/>
                   </pic:nvPicPr>
                   <pic:blipFill>
-                    <a:blip r:embed="rId9"/>
+                    <a:blip r:embed="rId10"/>
                     <a:stretch>
                       <a:fillRect/>
                     </a:stretch>
@@ -1089,8 +1330,13 @@
       <w:pPr>
         <w:pStyle w:val="BodyText"/>
       </w:pPr>
-      <w:r>
-        <w:t>So a difference is a disagreement between the model and the source — not a verdict about which one is wrong.</w:t>
+      <w:proofErr w:type="gramStart"/>
+      <w:r>
+        <w:t>So</w:t>
+      </w:r>
+      <w:proofErr w:type="gramEnd"/>
+      <w:r>
+        <w:t xml:space="preserve"> a difference is a disagreement between the model and the source — not a verdict about which one is wrong.</w:t>
       </w:r>
     </w:p>
     <w:p>
@@ -1136,7 +1382,7 @@
                     </pic:cNvPicPr>
                   </pic:nvPicPr>
                   <pic:blipFill>
-                    <a:blip r:embed="rId10"/>
+                    <a:blip r:embed="rId11"/>
                     <a:stretch>
                       <a:fillRect/>
                     </a:stretch>
@@ -1176,7 +1422,15 @@
         <w:t>LEAP Values</w:t>
       </w:r>
       <w:r>
-        <w:t xml:space="preserve"> is your energy balance exactly as LEAP produced it, converted to petajoules. Nothing has been changed. Use it to get your bearings — the rows and columns are the ones you already know.</w:t>
+        <w:t xml:space="preserve"> is your energy balance exactly as LEAP produced it, converted to petajoules. Nothing has </w:t>
+      </w:r>
+      <w:proofErr w:type="gramStart"/>
+      <w:r>
+        <w:t>been changed</w:t>
+      </w:r>
+      <w:proofErr w:type="gramEnd"/>
+      <w:r>
+        <w:t>. Use it to get your bearings — the rows and columns are the ones you already know.</w:t>
       </w:r>
     </w:p>
     <w:p>
@@ -1206,7 +1460,23 @@
         <w:t>Correct Source Values</w:t>
       </w:r>
       <w:r>
-        <w:t xml:space="preserve"> shows what the source data says each cell should be. When you want to know not just that something is wrong but what it ought to be, this is the sheet.</w:t>
+        <w:t xml:space="preserve"> </w:t>
+      </w:r>
+      <w:proofErr w:type="gramStart"/>
+      <w:r>
+        <w:t>shows</w:t>
+      </w:r>
+      <w:proofErr w:type="gramEnd"/>
+      <w:r>
+        <w:t xml:space="preserve"> what the source data says each cell should be. When you want to know not just that something is </w:t>
+      </w:r>
+      <w:proofErr w:type="gramStart"/>
+      <w:r>
+        <w:t>wrong</w:t>
+      </w:r>
+      <w:proofErr w:type="gramEnd"/>
+      <w:r>
+        <w:t xml:space="preserve"> but what it ought to be, this is the sheet.</w:t>
       </w:r>
     </w:p>
     <w:p>
@@ -1221,7 +1491,15 @@
         <w:t>Full Expected Source</w:t>
       </w:r>
       <w:r>
-        <w:t xml:space="preserve"> is the same again, but it also greys out the cells that do not exist in your balance structure at all. It answers “is this missing, or is it just not applicable here?”</w:t>
+        <w:t xml:space="preserve"> is the same again, but it also greys out the cells that do not exist in your balance structure at all. It </w:t>
+      </w:r>
+      <w:proofErr w:type="gramStart"/>
+      <w:r>
+        <w:t>answers</w:t>
+      </w:r>
+      <w:proofErr w:type="gramEnd"/>
+      <w:r>
+        <w:t xml:space="preserve"> “is this missing, or is it just not applicable here?”</w:t>
       </w:r>
     </w:p>
     <w:p>
@@ -1256,7 +1534,7 @@
       <w:r>
         <w:t xml:space="preserve">We are keeping track of known issues from the baseline seed’s here </w:t>
       </w:r>
-      <w:hyperlink r:id="rId11" w:history="1">
+      <w:hyperlink r:id="rId12" w:history="1">
         <w:r>
           <w:rPr>
             <w:rStyle w:val="Hyperlink"/>
@@ -1265,15 +1543,25 @@
         </w:r>
       </w:hyperlink>
       <w:r>
-        <w:t xml:space="preserve"> so check that for issues first.</w:t>
-      </w:r>
+        <w:t xml:space="preserve"> so check that for </w:t>
+      </w:r>
+      <w:proofErr w:type="gramStart"/>
+      <w:r>
+        <w:t>issues first.</w:t>
+      </w:r>
+      <w:proofErr w:type="gramEnd"/>
     </w:p>
     <w:p>
       <w:pPr>
         <w:pStyle w:val="FirstParagraph"/>
       </w:pPr>
-      <w:r>
-        <w:t>A difference on the error sheet is not automatically a mistake in LEAP. It is a disagreement between two things, and it can come from any of three places.</w:t>
+      <w:proofErr w:type="gramStart"/>
+      <w:r>
+        <w:t>A difference</w:t>
+      </w:r>
+      <w:proofErr w:type="gramEnd"/>
+      <w:r>
+        <w:t xml:space="preserve"> on the error sheet is not automatically a mistake in LEAP. It is a disagreement between two things, and it can come from any of three places.</w:t>
       </w:r>
     </w:p>
     <w:p>
@@ -1288,7 +1576,15 @@
         <w:t>1. LEAP is not calculating what the comparison expects.</w:t>
       </w:r>
       <w:r>
-        <w:t xml:space="preserve"> The fix is either to change the LEAP calculation method — the supply rules Luthfi teaches, for example — or to change the inputs generated for LEAP so it produces the intended result.</w:t>
+        <w:t xml:space="preserve"> The fix is either to change the LEAP calculation method — the supply rules </w:t>
+      </w:r>
+      <w:proofErr w:type="spellStart"/>
+      <w:r>
+        <w:t>Luthfi</w:t>
+      </w:r>
+      <w:proofErr w:type="spellEnd"/>
+      <w:r>
+        <w:t xml:space="preserve"> teaches, for example — or to change the inputs generated for LEAP so it produces the intended result.</w:t>
       </w:r>
     </w:p>
     <w:p>
@@ -1303,7 +1599,15 @@
         <w:t>2. The comparison itself is wrong.</w:t>
       </w:r>
       <w:r>
-        <w:t xml:space="preserve"> The mapping between the source data and the LEAP balance categories may be incorrect, or there may be a problem in the code applying it. These are being worked through steadily, and fixing them improves several other parts of the process at the same time.</w:t>
+        <w:t xml:space="preserve"> The mapping between the source data and the LEAP balance categories may be incorrect, or there may be a problem in the code applying it. These are being worked through </w:t>
+      </w:r>
+      <w:proofErr w:type="gramStart"/>
+      <w:r>
+        <w:t>steadily, and</w:t>
+      </w:r>
+      <w:proofErr w:type="gramEnd"/>
+      <w:r>
+        <w:t xml:space="preserve"> fixing them improves several other parts of the process at the same time.</w:t>
       </w:r>
     </w:p>
     <w:p>
@@ -1407,6 +1711,9 @@
         <w:pStyle w:val="SourceCode"/>
       </w:pPr>
       <w:r>
+        <w:rPr>
+          <w:noProof/>
+        </w:rPr>
         <w:drawing>
           <wp:inline distT="0" distB="0" distL="0" distR="0" wp14:anchorId="55EFF167" wp14:editId="46F5D17B">
             <wp:extent cx="5943600" cy="2335530"/>
@@ -1423,7 +1730,7 @@
                     <pic:cNvPicPr/>
                   </pic:nvPicPr>
                   <pic:blipFill>
-                    <a:blip r:embed="rId12"/>
+                    <a:blip r:embed="rId13"/>
                     <a:stretch>
                       <a:fillRect/>
                     </a:stretch>
@@ -1465,14 +1772,25 @@
         <w:pStyle w:val="BodyText"/>
       </w:pPr>
       <w:r>
-        <w:t>Some sector pages may be missing. That is deliberate: if LEAP has no separately modelled detail for a sector in that economy, a page would be misleading, so it is left out. The run tells you which ones and why.</w:t>
-      </w:r>
-    </w:p>
-    <w:p>
-      <w:pPr>
-        <w:pStyle w:val="BodyText"/>
-      </w:pPr>
-      <w:r>
+        <w:t xml:space="preserve">Some sector pages may be missing. That is deliberate: if LEAP has no separately modelled </w:t>
+      </w:r>
+      <w:proofErr w:type="gramStart"/>
+      <w:r>
+        <w:t>detail</w:t>
+      </w:r>
+      <w:proofErr w:type="gramEnd"/>
+      <w:r>
+        <w:t xml:space="preserve"> for a sector in that economy, a page would be misleading, so it is left out. The run tells you which ones and why.</w:t>
+      </w:r>
+    </w:p>
+    <w:p>
+      <w:pPr>
+        <w:pStyle w:val="BodyText"/>
+      </w:pPr>
+      <w:r>
+        <w:rPr>
+          <w:noProof/>
+        </w:rPr>
         <w:lastRenderedPageBreak/>
         <w:drawing>
           <wp:inline distT="0" distB="0" distL="0" distR="0" wp14:anchorId="2BA07B3E" wp14:editId="364BE7AA">
@@ -1490,7 +1808,7 @@
                     <pic:cNvPicPr/>
                   </pic:nvPicPr>
                   <pic:blipFill>
-                    <a:blip r:embed="rId13"/>
+                    <a:blip r:embed="rId14"/>
                     <a:stretch>
                       <a:fillRect/>
                     </a:stretch>
@@ -1543,7 +1861,15 @@
         <w:pStyle w:val="FirstParagraph"/>
       </w:pPr>
       <w:r>
-        <w:t>Everything is grouped by economy, so nothing you produce overwrites anything else.</w:t>
+        <w:t xml:space="preserve">Everything is grouped by economy, so nothing you produce </w:t>
+      </w:r>
+      <w:proofErr w:type="gramStart"/>
+      <w:r>
+        <w:t>overwrites</w:t>
+      </w:r>
+      <w:proofErr w:type="gramEnd"/>
+      <w:r>
+        <w:t xml:space="preserve"> anything else.</w:t>
       </w:r>
     </w:p>
     <w:p>
@@ -1572,7 +1898,21 @@
         <w:rPr>
           <w:rStyle w:val="VerbatimChar"/>
         </w:rPr>
-        <w:t xml:space="preserve">    balance_review/    workbooks for the USA</w:t>
+        <w:t xml:space="preserve">    </w:t>
+      </w:r>
+      <w:proofErr w:type="spellStart"/>
+      <w:r>
+        <w:rPr>
+          <w:rStyle w:val="VerbatimChar"/>
+        </w:rPr>
+        <w:t>balance_review</w:t>
+      </w:r>
+      <w:proofErr w:type="spellEnd"/>
+      <w:r>
+        <w:rPr>
+          <w:rStyle w:val="VerbatimChar"/>
+        </w:rPr>
+        <w:t>/    workbooks for the USA</w:t>
       </w:r>
       <w:r>
         <w:br/>
@@ -1599,7 +1939,21 @@
         <w:rPr>
           <w:rStyle w:val="VerbatimChar"/>
         </w:rPr>
-        <w:t xml:space="preserve">    balance_review/</w:t>
+        <w:t xml:space="preserve">    </w:t>
+      </w:r>
+      <w:proofErr w:type="spellStart"/>
+      <w:r>
+        <w:rPr>
+          <w:rStyle w:val="VerbatimChar"/>
+        </w:rPr>
+        <w:t>balance_review</w:t>
+      </w:r>
+      <w:proofErr w:type="spellEnd"/>
+      <w:r>
+        <w:rPr>
+          <w:rStyle w:val="VerbatimChar"/>
+        </w:rPr>
+        <w:t>/</w:t>
       </w:r>
       <w:r>
         <w:br/>
@@ -1623,15 +1977,22 @@
       <w:pPr>
         <w:pStyle w:val="BodyText"/>
       </w:pPr>
-      <w:r>
-        <w:t xml:space="preserve">Beside your results you will find a </w:t>
-      </w:r>
+      <w:proofErr w:type="gramStart"/>
+      <w:r>
+        <w:t>Beside</w:t>
+      </w:r>
+      <w:proofErr w:type="gramEnd"/>
+      <w:r>
+        <w:t xml:space="preserve"> your results you will find a </w:t>
+      </w:r>
+      <w:proofErr w:type="spellStart"/>
       <w:r>
         <w:rPr>
           <w:rStyle w:val="VerbatimChar"/>
         </w:rPr>
         <w:t>run_records</w:t>
       </w:r>
+      <w:proofErr w:type="spellEnd"/>
       <w:r>
         <w:t xml:space="preserve"> folder. Each run leaves a dated record in there showing exactly which files it used and when. You can ignore it day to day — it is there so that months later you can answer “which export did this come from?” with certainty rather than memory.</w:t>
       </w:r>
@@ -1678,8 +2039,16 @@
         <w:rPr>
           <w:rStyle w:val="VerbatimChar"/>
         </w:rPr>
-        <w:t>.\leap-review-tools.exe selfcheck</w:t>
-      </w:r>
+        <w:t xml:space="preserve">.\leap-review-tools.exe </w:t>
+      </w:r>
+      <w:proofErr w:type="spellStart"/>
+      <w:r>
+        <w:rPr>
+          <w:rStyle w:val="VerbatimChar"/>
+        </w:rPr>
+        <w:t>selfcheck</w:t>
+      </w:r>
+      <w:proofErr w:type="spellEnd"/>
     </w:p>
     <w:p>
       <w:pPr>
@@ -1688,11 +2057,19 @@
       <w:r>
         <w:t xml:space="preserve">You want to see </w:t>
       </w:r>
-      <w:r>
-        <w:rPr>
-          <w:rStyle w:val="VerbatimChar"/>
-        </w:rPr>
-        <w:t>result : OK</w:t>
+      <w:proofErr w:type="gramStart"/>
+      <w:r>
+        <w:rPr>
+          <w:rStyle w:val="VerbatimChar"/>
+        </w:rPr>
+        <w:t>result :</w:t>
+      </w:r>
+      <w:proofErr w:type="gramEnd"/>
+      <w:r>
+        <w:rPr>
+          <w:rStyle w:val="VerbatimChar"/>
+        </w:rPr>
+        <w:t xml:space="preserve"> OK</w:t>
       </w:r>
       <w:r>
         <w:t>.</w:t>
@@ -1710,14 +2087,24 @@
         <w:t>Read the validation report.</w:t>
       </w:r>
       <w:r>
-        <w:t xml:space="preserve"> Every run leaves one in its </w:t>
-      </w:r>
+        <w:t xml:space="preserve"> Every run </w:t>
+      </w:r>
+      <w:proofErr w:type="gramStart"/>
+      <w:r>
+        <w:t>leaves</w:t>
+      </w:r>
+      <w:proofErr w:type="gramEnd"/>
+      <w:r>
+        <w:t xml:space="preserve"> one in its </w:t>
+      </w:r>
+      <w:proofErr w:type="spellStart"/>
       <w:r>
         <w:rPr>
           <w:rStyle w:val="VerbatimChar"/>
         </w:rPr>
         <w:t>run_records</w:t>
       </w:r>
+      <w:proofErr w:type="spellEnd"/>
       <w:r>
         <w:t xml:space="preserve"> folder, whether it succeeded or not. If a run stopped, this file says which input was wrong and what was expected. Most problems are answered here.</w:t>
       </w:r>
@@ -1809,7 +2196,15 @@
         <w:t>config</w:t>
       </w:r>
       <w:r>
-        <w:t>. It holds the settings the tools use: which sectors appear on which dashboard page, the colours, the series labels, and the mapping information behind the comparison.</w:t>
+        <w:t xml:space="preserve">. It holds the settings the tools use: which sectors appear on which dashboard page, the </w:t>
+      </w:r>
+      <w:proofErr w:type="spellStart"/>
+      <w:r>
+        <w:t>colours</w:t>
+      </w:r>
+      <w:proofErr w:type="spellEnd"/>
+      <w:r>
+        <w:t>, the series labels, and the mapping information behind the comparison.</w:t>
       </w:r>
     </w:p>
     <w:p>
@@ -1843,7 +2238,23 @@
         <w:pStyle w:val="FirstParagraph"/>
       </w:pPr>
       <w:r>
-        <w:t>Your LEAP model is compared against two reference datasets that come with the tools: the ESTO historical data, and the 9th Outlook projections. You do not need to supply either — they are already in the folder.</w:t>
+        <w:t xml:space="preserve">Your LEAP model is compared against two reference datasets that come with the tools: the ESTO historical data, and the 9th Outlook projections. You do not need to supply </w:t>
+      </w:r>
+      <w:proofErr w:type="gramStart"/>
+      <w:r>
+        <w:t>either —</w:t>
+      </w:r>
+      <w:proofErr w:type="gramEnd"/>
+      <w:r>
+        <w:t xml:space="preserve"> </w:t>
+      </w:r>
+      <w:proofErr w:type="gramStart"/>
+      <w:r>
+        <w:t>they</w:t>
+      </w:r>
+      <w:proofErr w:type="gramEnd"/>
+      <w:r>
+        <w:t xml:space="preserve"> are already in the folder.</w:t>
       </w:r>
     </w:p>
     <w:p>
@@ -1878,7 +2289,21 @@
         <w:rPr>
           <w:rStyle w:val="VerbatimChar"/>
         </w:rPr>
-        <w:t>.\leap-review-tools.exe dashboard-from-export --economy 20_USA --esto-table-path "input\00APEC_2026_low_with_subtotals.csv"</w:t>
+        <w:t>.\leap-review-tools.exe dashboard-from-export --economy 20_USA --</w:t>
+      </w:r>
+      <w:proofErr w:type="spellStart"/>
+      <w:r>
+        <w:rPr>
+          <w:rStyle w:val="VerbatimChar"/>
+        </w:rPr>
+        <w:t>esto</w:t>
+      </w:r>
+      <w:proofErr w:type="spellEnd"/>
+      <w:r>
+        <w:rPr>
+          <w:rStyle w:val="VerbatimChar"/>
+        </w:rPr>
+        <w:t>-table-path "input\00APEC_2026_low_with_subtotals.csv"</w:t>
       </w:r>
     </w:p>
     <w:p>
@@ -1894,7 +2319,15 @@
         <w:pStyle w:val="BodyText"/>
       </w:pPr>
       <w:r>
-        <w:t>Two things worth knowing. An ESTO update does not change the projections — the 9th Outlook is finished and will not be reissued. In future this comparison may be run against a different projection instead, with its own mappings to the LEAP and ESTO data; the tools are built to accommodate that when it happens. And each run records which file it used, so a result can always be traced back to the data behind it.</w:t>
+        <w:t xml:space="preserve">Two things worth knowing. An ESTO update does not change the projections — the 9th Outlook is finished and will not be reissued. In future this comparison may be run against a different projection instead, with its own mappings to the LEAP and ESTO data; the tools are built to accommodate that when it happens. And each run records which file it </w:t>
+      </w:r>
+      <w:proofErr w:type="gramStart"/>
+      <w:r>
+        <w:t>used</w:t>
+      </w:r>
+      <w:proofErr w:type="gramEnd"/>
+      <w:r>
+        <w:t>, so a result can always be traced back to the data behind it.</w:t>
       </w:r>
     </w:p>
     <w:p>
@@ -1919,31 +2352,71 @@
         <w:pStyle w:val="FirstParagraph"/>
       </w:pPr>
       <w:r>
-        <w:t>It is a plain spreadsheet file, so it can be opened and changed — but please don’t, even to correct something that looks wrong.</w:t>
-      </w:r>
-    </w:p>
-    <w:p>
-      <w:pPr>
-        <w:pStyle w:val="BodyText"/>
-      </w:pPr>
-      <w:r>
-        <w:t>The tools already add the rows a particular ESTO issue is missing. Newer categories such as datacentres and hydrogen transformation are filled in automatically from a reviewed list, with zero values, so the structure is complete. A row you add by hand skips that review and will not match what the comparison expects.</w:t>
-      </w:r>
-    </w:p>
-    <w:p>
-      <w:pPr>
-        <w:pStyle w:val="BodyText"/>
-      </w:pPr>
-      <w:r>
-        <w:t>The tools also adjust the data as they read it — own-use and loss rows are sign-corrected, and subtotal rows are set aside so nothing is counted twice. So a value in the file will not always look like the value in your results, and that is correct rather than a sign of a problem.</w:t>
-      </w:r>
-    </w:p>
-    <w:p>
-      <w:pPr>
-        <w:pStyle w:val="BodyText"/>
-      </w:pPr>
-      <w:r>
-        <w:t>Every run records exactly which reference files it used. A file that has been edited by hand is one nobody else has, which means a result built on it cannot be reproduced or checked by anyone else.</w:t>
+        <w:t xml:space="preserve">It is a plain spreadsheet file, so it can be opened and changed — but please don’t, </w:t>
+      </w:r>
+      <w:proofErr w:type="gramStart"/>
+      <w:r>
+        <w:t>even to</w:t>
+      </w:r>
+      <w:proofErr w:type="gramEnd"/>
+      <w:r>
+        <w:t xml:space="preserve"> correct something that looks wrong.</w:t>
+      </w:r>
+    </w:p>
+    <w:p>
+      <w:pPr>
+        <w:pStyle w:val="BodyText"/>
+      </w:pPr>
+      <w:r>
+        <w:t xml:space="preserve">The tools already add the rows a particular ESTO issue is missing. Newer categories such as </w:t>
+      </w:r>
+      <w:proofErr w:type="spellStart"/>
+      <w:r>
+        <w:t>datacentres</w:t>
+      </w:r>
+      <w:proofErr w:type="spellEnd"/>
+      <w:r>
+        <w:t xml:space="preserve"> and hydrogen transformation are filled in automatically from a reviewed list, with zero values, so the structure is complete. A row you add by hand skips that review and will not match what the comparison expects.</w:t>
+      </w:r>
+    </w:p>
+    <w:p>
+      <w:pPr>
+        <w:pStyle w:val="BodyText"/>
+      </w:pPr>
+      <w:r>
+        <w:t xml:space="preserve">The tools also adjust the data as they read it — own-use and loss rows are sign-corrected, and subtotal rows are set aside so nothing is counted twice. </w:t>
+      </w:r>
+      <w:proofErr w:type="gramStart"/>
+      <w:r>
+        <w:t>So</w:t>
+      </w:r>
+      <w:proofErr w:type="gramEnd"/>
+      <w:r>
+        <w:t xml:space="preserve"> a value in the file will not always look like the value in your results, and that is correct rather than a sign of a problem.</w:t>
+      </w:r>
+    </w:p>
+    <w:p>
+      <w:pPr>
+        <w:pStyle w:val="BodyText"/>
+      </w:pPr>
+      <w:r>
+        <w:t xml:space="preserve">Every run </w:t>
+      </w:r>
+      <w:proofErr w:type="gramStart"/>
+      <w:r>
+        <w:t>records</w:t>
+      </w:r>
+      <w:proofErr w:type="gramEnd"/>
+      <w:r>
+        <w:t xml:space="preserve"> exactly which reference files it </w:t>
+      </w:r>
+      <w:proofErr w:type="gramStart"/>
+      <w:r>
+        <w:t>used</w:t>
+      </w:r>
+      <w:proofErr w:type="gramEnd"/>
+      <w:r>
+        <w:t>. A file that has been edited by hand is one nobody else has, which means a result built on it cannot be reproduced or checked by anyone else.</w:t>
       </w:r>
     </w:p>
     <w:p>
@@ -2001,8 +2474,16 @@
         <w:rPr>
           <w:rStyle w:val="VerbatimChar"/>
         </w:rPr>
-        <w:t>.\leap-review-tools.exe selfcheck</w:t>
-      </w:r>
+        <w:t xml:space="preserve">.\leap-review-tools.exe </w:t>
+      </w:r>
+      <w:proofErr w:type="spellStart"/>
+      <w:r>
+        <w:rPr>
+          <w:rStyle w:val="VerbatimChar"/>
+        </w:rPr>
+        <w:t>selfcheck</w:t>
+      </w:r>
+      <w:proofErr w:type="spellEnd"/>
     </w:p>
     <w:p>
       <w:pPr>

</xml_diff>